<commit_message>
docs(pricing): reconcile sandbox charges and clarify free allowance versus credits
</commit_message>
<xml_diff>
--- a/docs/project/presentacion/costos-whatsapp-agente-ia.docx
+++ b/docs/project/presentacion/costos-whatsapp-agente-ia.docx
@@ -342,6 +342,38 @@
         </w:tc>
       </w:tr>
     </w:tbl>
+    <w:p>
+      <w:pPr>
+        <w:pStyle w:val="Heading1"/>
+      </w:pPr>
+      <w:r>
+        <w:t>El cupo mensual y los créditos son independientes</w:t>
+      </w:r>
+    </w:p>
+    <w:p>
+      <w:pPr>
+        <w:spacing w:after="100"/>
+      </w:pPr>
+      <w:r>
+        <w:rPr>
+          <w:b w:val="0"/>
+          <w:sz w:val="19"/>
+        </w:rPr>
+        <w:t>Free incluye 2 000 mensajes mensuales de plataforma, pero el envío del Sandbox consume créditos aparte. Los US$2 de bienvenida se entregan una sola vez. Al agotarse, hay que recargar para seguir enviando; se puede conservar Free.</w:t>
+      </w:r>
+    </w:p>
+    <w:p>
+      <w:pPr>
+        <w:spacing w:after="100"/>
+      </w:pPr>
+      <w:r>
+        <w:rPr>
+          <w:b w:val="0"/>
+          <w:sz w:val="19"/>
+        </w:rPr>
+        <w:t>Comprobación de la cuenta de prueba: 15 mensajes, de los cuales 7 fueron recibidos y 8 enviados/leídos. El cargo visible por WhatsApp de US$0,24 coincide con 8 respuestas × US$0,03. El disponible mostrado queda en US$1,76.</w:t>
+      </w:r>
+    </w:p>
     <w:p>
       <w:pPr>
         <w:pStyle w:val="Heading1"/>
@@ -2849,7 +2881,7 @@
           <w:b w:val="0"/>
           <w:sz w:val="19"/>
         </w:rPr>
-        <w:t>La fila de 200 reservas no deja margen para consultas adicionales. Preguntas sin reserva, cambios y cancelaciones también consumen mensajes. Conviene mantener saldo operativo positivo; Free y su cupo mensual no significan envío ilimitado ni recarga mensual gratuita.</w:t>
+        <w:t>La fila de 200 reservas no deja margen para consultas adicionales. Preguntas sin reserva, cambios y cancelaciones también consumen mensajes. Con facturación por créditos de Kapso se debe prever saldo operativo inicial: US$5 de saldo cuestan US$5,55 en la cuenta examinada. Los ceros son consumo estimado dentro de la franquicia; no garantizan envío con saldo cero.</w:t>
       </w:r>
     </w:p>
     <w:p>

</xml_diff>